<commit_message>
v2: rename to ParaSleep, add server training, remove failed experiments
</commit_message>
<xml_diff>
--- a/MetaBCI睡眠分期项目-新增功能技术说明.docx
+++ b/MetaBCI睡眠分期项目-新增功能技术说明.docx
@@ -23,7 +23,7 @@
       </w:r>
       <w:r>
         <w:br/>
-        <w:t>2026年05月27日</w:t>
+        <w:t>2026年06月17日</w:t>
       </w:r>
     </w:p>
     <w:p/>
@@ -258,7 +258,7 @@
           </w:tcPr>
           <w:p>
             <w:r>
-              <w:t>LWSleepNet</w:t>
+              <w:t>ParaSleep</w:t>
               <w:br/>
               <w:t>轻量级模型</w:t>
             </w:r>
@@ -282,7 +282,7 @@
           </w:tcPr>
           <w:p>
             <w:r>
-              <w:t>lwsleepnet.py</w:t>
+              <w:t>parasleep.py</w:t>
             </w:r>
           </w:p>
         </w:tc>
@@ -654,7 +654,7 @@
         <w:pStyle w:val="Heading2"/>
       </w:pPr>
       <w:r>
-        <w:t>3.3 LWSleepNet (核心创新)</w:t>
+        <w:t>3.3 ParaSleep (核心创新)</w:t>
       </w:r>
     </w:p>
     <w:p>
@@ -662,7 +662,7 @@
         <w:rPr>
           <w:i/>
         </w:rPr>
-        <w:t>文件位置：metabci/brainda/algorithms/deep_learning/lwsleepnet.py</w:t>
+        <w:t>文件位置：metabci/brainda/algorithms/deep_learning/parasleep.py</w:t>
       </w:r>
     </w:p>
     <w:p>
@@ -751,7 +751,7 @@
         <w:pStyle w:val="ListBullet"/>
       </w:pPr>
       <w:r>
-        <w:t>pre(): 加载LWSleepNet模型到CPU，创建LSL StreamOutlet</w:t>
+        <w:t>pre(): 加载ParaSleep模型到CPU，创建LSL StreamOutlet</w:t>
       </w:r>
     </w:p>
     <w:p>
@@ -984,7 +984,7 @@
     </w:p>
     <w:p>
       <w:r>
-        <w:t>Sleep-EDF → SleepEDFDataset → SleepParadigm → LWSleepNet (训练) → ONNX+INT8 (部署)</w:t>
+        <w:t>Sleep-EDF → SleepEDFDataset → SleepParadigm → ParaSleep (训练) → ONNX+INT8 (部署)</w:t>
         <w:br/>
         <w:t>EEG设备/EDF回放 → Marker(30s连续) → SleepOnlineWorker → SleepMonitorUI/LSL</w:t>
       </w:r>
@@ -1109,7 +1109,7 @@
           </w:tcPr>
           <w:p>
             <w:r>
-              <w:t>功能2: SleepParadigm + 功能3: LWSleepNet</w:t>
+              <w:t>功能2: SleepParadigm + 功能3: ParaSleep</w:t>
             </w:r>
           </w:p>
         </w:tc>
@@ -1401,7 +1401,7 @@
         <w:pStyle w:val="ListBullet"/>
       </w:pPr>
       <w:r>
-        <w:t xml:space="preserve">    lwsleepnet.py                                  # LWSleepNet</w:t>
+        <w:t xml:space="preserve">    parasleep.py                                  # ParaSleep</w:t>
       </w:r>
     </w:p>
     <w:p>
@@ -1449,7 +1449,7 @@
         <w:pStyle w:val="ListBullet"/>
       </w:pPr>
       <w:r>
-        <w:t>examples/sleep_staging/train_lwsleepnet.py         # 训练脚本</w:t>
+        <w:t>examples/sleep_staging/train_parasleep.py         # 训练脚本</w:t>
       </w:r>
     </w:p>
     <w:p>

</xml_diff>